<commit_message>
lara-project-api for vue project
</commit_message>
<xml_diff>
--- a/LINK.docx
+++ b/LINK.docx
@@ -12,6 +12,23 @@
         </w:r>
       </w:hyperlink>
     </w:p>
+    <w:p/>
+    <w:p>
+      <w:r>
+        <w:t>Vu.js</w:t>
+      </w:r>
+    </w:p>
+    <w:p>
+      <w:hyperlink r:id="rId5" w:history="1">
+        <w:r>
+          <w:rPr>
+            <w:rStyle w:val="Hyperlink"/>
+          </w:rPr>
+          <w:t>https://chatgpt.com/s/t_6ad440b1e2788191a244f3830d487e20</w:t>
+        </w:r>
+      </w:hyperlink>
+    </w:p>
+    <w:p/>
     <w:p/>
     <w:sectPr>
       <w:pgSz w:w="12240" w:h="15840"/>

</xml_diff>